<commit_message>
Use EB Garamond throughout and simplify the TOC
</commit_message>
<xml_diff>
--- a/references/reference.docx
+++ b/references/reference.docx
@@ -864,7 +864,7 @@
   <w:docDefaults>
     <w:rPrDefault>
       <w:rPr>
-        <w:rFonts w:ascii="Cambria" w:hAnsi="Cambria" w:eastAsia="Cambria" w:cs="" w:asciiTheme="minorHAnsi" w:cstheme="minorBidi" w:eastAsiaTheme="minorHAnsi" w:hAnsiTheme="minorHAnsi"/>
+        <w:rFonts w:ascii="EB Garamond" w:hAnsi="EB Garamond" w:eastAsia="Cambria" w:cs="" w:cstheme="minorBidi" w:eastAsiaTheme="minorHAnsi"/>
         <w:sz w:val="24"/>
         <w:szCs w:val="24"/>
         <w:lang w:val="en-US" w:eastAsia="en-US" w:bidi="ar-SA"/>
@@ -1108,7 +1108,7 @@
     <w:basedOn w:val="BodyTextChar"/>
     <w:qFormat/>
     <w:rPr>
-      <w:rFonts w:ascii="Consolas" w:hAnsi="Consolas"/>
+      <w:rFonts w:ascii="EB Garamond" w:hAnsi="EB Garamond"/>
       <w:sz w:val="22"/>
     </w:rPr>
   </w:style>
@@ -1194,7 +1194,7 @@
       <w:spacing w:before="240" w:after="120"/>
     </w:pPr>
     <w:rPr>
-      <w:rFonts w:ascii="Liberation Sans" w:hAnsi="Liberation Sans" w:eastAsia="Noto Sans CJK SC" w:cs="Noto Sans Devanagari"/>
+      <w:rFonts w:ascii="EB Garamond" w:hAnsi="EB Garamond" w:eastAsia="Noto Sans CJK SC" w:cs="Noto Sans Devanagari"/>
       <w:sz w:val="28"/>
       <w:szCs w:val="28"/>
     </w:rPr>
@@ -1754,12 +1754,12 @@
     </a:clrScheme>
     <a:fontScheme name="Office">
       <a:majorFont>
-        <a:latin typeface="Calibri" pitchFamily="0" charset="1"/>
+        <a:latin typeface="EB Garamond" pitchFamily="0" charset="1"/>
         <a:ea typeface=""/>
         <a:cs typeface=""/>
       </a:majorFont>
       <a:minorFont>
-        <a:latin typeface="Cambria" pitchFamily="0" charset="1"/>
+        <a:latin typeface="EB Garamond" pitchFamily="0" charset="1"/>
         <a:ea typeface=""/>
         <a:cs typeface=""/>
       </a:minorFont>

</xml_diff>